<commit_message>
fix: factory boy + faker
</commit_message>
<xml_diff>
--- a/docs/final-report.docx
+++ b/docs/final-report.docx
@@ -1167,7 +1167,7 @@
           <w:sz w:val="22"/>
           <w:szCs w:val="22"/>
         </w:rPr>
-        <w:t xml:space="preserve">Test piramidi tabanda çok sayıda hızlı unit testten, ortada servisleri gerçek veritabanıyla doğrulayan integration testlerine, zirvede ise az sayıda uçtan uca senaryoya doğru kurulmuştur. Katman dağılımı:</w:t>
+        <w:t xml:space="preserve">Test piramidi tabanda çok sayıda hızlı unit testten, ortada servisleri gerçek veritabanıyla doğrulayan integration testlerine, zirvede ise uçtan uca senaryolara doğru kurulmuştur. Katman dağılımı:</w:t>
       </w:r>
     </w:p>
     <w:tbl>
@@ -1344,7 +1344,7 @@
                 <w:sz w:val="20"/>
                 <w:szCs w:val="20"/>
               </w:rPr>
-              <w:t xml:space="preserve">124</w:t>
+              <w:t xml:space="preserve">136</w:t>
             </w:r>
           </w:p>
         </w:tc>
@@ -1375,7 +1375,7 @@
                 <w:sz w:val="20"/>
                 <w:szCs w:val="20"/>
               </w:rPr>
-              <w:t xml:space="preserve">pytest + mock; servisler, yardımcılar ve şema doğrulamaları</w:t>
+              <w:t xml:space="preserve">pytest + mock; servisler, yardımcılar, şema ve factory doğrulamaları</w:t>
             </w:r>
           </w:p>
         </w:tc>
@@ -1439,7 +1439,7 @@
                 <w:sz w:val="20"/>
                 <w:szCs w:val="20"/>
               </w:rPr>
-              <w:t xml:space="preserve">141</w:t>
+              <w:t xml:space="preserve">145</w:t>
             </w:r>
           </w:p>
         </w:tc>
@@ -1565,7 +1565,7 @@
                 <w:sz w:val="20"/>
                 <w:szCs w:val="20"/>
               </w:rPr>
-              <w:t xml:space="preserve">Playwright (3 dosya): API akışı + UI kullanıcı senaryoları</w:t>
+              <w:t xml:space="preserve">Playwright (3 dosya): API akışı + UI kullanıcı senaryoları (CI'da koşar)</w:t>
             </w:r>
           </w:p>
         </w:tc>
@@ -1755,7 +1755,7 @@
                 <w:sz w:val="20"/>
                 <w:szCs w:val="20"/>
               </w:rPr>
-              <w:t xml:space="preserve">k6 (health → rooms → book → cancel)</w:t>
+              <w:t xml:space="preserve">k6 (health → rooms → book → cancel) — CI'da regresyon kapısı</w:t>
             </w:r>
           </w:p>
         </w:tc>
@@ -1786,14 +1786,14 @@
           <w:sz w:val="22"/>
           <w:szCs w:val="22"/>
         </w:rPr>
-        <w:t xml:space="preserve">Unit + integration koşumu 277 test geçer, 0 hata. </w:t>
+        <w:t xml:space="preserve">Unit + integration koşumu 293 test geçer, 0 hata. </w:t>
       </w:r>
       <w:r>
         <w:rPr>
           <w:sz w:val="22"/>
           <w:szCs w:val="22"/>
         </w:rPr>
-        <w:t xml:space="preserve">Toplam 290 test fonksiyonu (124 unit + 141 integration + 25 E2E). </w:t>
+        <w:t xml:space="preserve">Toplam 306 test fonksiyonu (136 unit + 145 integration + 25 E2E). </w:t>
       </w:r>
       <w:r>
         <w:rPr>
@@ -1817,7 +1817,7 @@
           <w:sz w:val="22"/>
           <w:szCs w:val="22"/>
         </w:rPr>
-        <w:t xml:space="preserve">Test verisi: tests/factories.py içinde Factory Boy + Faker ile RoomFactory ve BookingFactory; gerçekçi oda/rezervasyon verisi üretir.</w:t>
+        <w:t xml:space="preserve">Test verisi: tests/factories.py içinde Factory Boy + Faker ile RoomFactory, BookingFactory, HotelFactory ve UserFactory; gerçekçi veri üretir ve paylaşılan fixture'lar (sample_hotel/sample_room/book_room) dahil suite genelinde aktif kullanılır.</w:t>
       </w:r>
     </w:p>
     <w:p>
@@ -1851,7 +1851,7 @@
           <w:sz w:val="22"/>
           <w:szCs w:val="22"/>
         </w:rPr>
-        <w:t xml:space="preserve">Test hijyeni: OpenTelemetry test altında kapatılarak (otel_enabled bayrağı) collector'a bağlanma hatası önlenir; senkron SQLAlchemy çağrıları MagicMock ile mock'lanarak uyarısız, izole çıktı sağlanır.</w:t>
+        <w:t xml:space="preserve">Test hijyeni &amp; dayanıklılık: OpenTelemetry test altında kapatılır (otel_enabled bayrağı); senkron SQLAlchemy çağrıları MagicMock ile mock'lanır; LocalStack S3 testleri Docker yoksa hata yerine zarifçe skip edilir.</w:t>
       </w:r>
     </w:p>
     <w:p>
@@ -2211,7 +2211,7 @@
           <w:sz w:val="22"/>
           <w:szCs w:val="22"/>
         </w:rPr>
-        <w:t xml:space="preserve">Boru hattı şartnamedeki sırayı uygular: lint → test → build → deploy → smoke.</w:t>
+        <w:t xml:space="preserve">Boru hattı şartnamedeki sırayı uygular ve genişletir: lint → test → build → smoke → Newman → E2E → k6 → deploy → smoke.</w:t>
       </w:r>
     </w:p>
     <w:p>
@@ -2245,7 +2245,7 @@
           <w:sz w:val="22"/>
           <w:szCs w:val="22"/>
         </w:rPr>
-        <w:t xml:space="preserve">test: pytest --cov=src --cov-fail-under=70 (postgres:16 servis container'ı ile).</w:t>
+        <w:t xml:space="preserve">test: pytest --cov=src --cov-fail-under=70 (postgres:16 servis container'ı ile); 293 test, %98.5 coverage.</w:t>
       </w:r>
     </w:p>
     <w:p>
@@ -2262,7 +2262,7 @@
           <w:sz w:val="22"/>
           <w:szCs w:val="22"/>
         </w:rPr>
-        <w:t xml:space="preserve">build + smoke + Newman: docker build, docker compose up, /health smoke, ardından Newman ile Postman koleksiyonu.</w:t>
+        <w:t xml:space="preserve">docker build + compose up + /health smoke + Newman (Postman) + Playwright E2E (25 senaryo) + k6 performans kapısı — hepsi canlı stack üzerinde.</w:t>
       </w:r>
     </w:p>
     <w:p>
@@ -2319,7 +2319,7 @@
           <w:sz w:val="22"/>
           <w:szCs w:val="22"/>
         </w:rPr>
-        <w:t xml:space="preserve">k6 yük testi (perf/load-test.js): 30s→10 VU, 1m→50 VU, 30s→0 (toplam 2 dk). Her VU sırasıyla health → müsait oda listele → rezervasyon oluştur → iptal akışını koşar. Eşik: p95 &lt; 500 ms ve hata oranı &lt; %5.</w:t>
+        <w:t xml:space="preserve">k6 yük testi (perf/load-test.js): yerelde 30s→10 VU, 1m→50 VU, 30s→0; CI profilinde (K6_PROFILE=ci) ~35 sn'lik kısa koşu. Her VU sırasıyla health → müsait oda listele → rezervasyon oluştur → iptal akışını koşar. Eşik (her iki profilde): p95 &lt; 500 ms ve hata oranı &lt; %5; ihlalde k6 non-zero exit eder ve CI kırmızı olur — yani gerçek bir regresyon kapısıdır.</w:t>
       </w:r>
     </w:p>
     <w:tbl>
@@ -3129,7 +3129,7 @@
                 <w:sz w:val="20"/>
                 <w:szCs w:val="20"/>
               </w:rPr>
-              <w:t xml:space="preserve">277 geçer, 0 hata</w:t>
+              <w:t xml:space="preserve">293 geçer, 0 hata</w:t>
             </w:r>
           </w:p>
         </w:tc>
@@ -3193,7 +3193,7 @@
                 <w:sz w:val="20"/>
                 <w:szCs w:val="20"/>
               </w:rPr>
-              <w:t xml:space="preserve">290 (124 unit · 141 integration · 25 E2E)</w:t>
+              <w:t xml:space="preserve">306 (136 unit · 145 integration · 25 E2E)</w:t>
             </w:r>
           </w:p>
         </w:tc>
@@ -3321,7 +3321,7 @@
                 <w:sz w:val="20"/>
                 <w:szCs w:val="20"/>
               </w:rPr>
-              <w:t xml:space="preserve">7 istek</w:t>
+              <w:t xml:space="preserve">7 istek (CI'da)</w:t>
             </w:r>
           </w:p>
         </w:tc>
@@ -3354,7 +3354,7 @@
                 <w:sz w:val="20"/>
                 <w:szCs w:val="20"/>
               </w:rPr>
-              <w:t xml:space="preserve">k6 p95 latency</w:t>
+              <w:t xml:space="preserve">k6 performans kapısı</w:t>
             </w:r>
           </w:p>
         </w:tc>
@@ -3385,7 +3385,7 @@
                 <w:sz w:val="20"/>
                 <w:szCs w:val="20"/>
               </w:rPr>
-              <w:t xml:space="preserve">465.56 ms (&lt; 500 ms)</w:t>
+              <w:t xml:space="preserve">p95 &lt; 500 ms (CI regresyon kapısı)</w:t>
             </w:r>
           </w:p>
         </w:tc>
@@ -3645,7 +3645,7 @@
           <w:sz w:val="22"/>
           <w:szCs w:val="22"/>
         </w:rPr>
-        <w:t xml:space="preserve">CI'da gerçek Minikube deploy: app açılışta Alembic migration koştuğu için PostgreSQL bağımlılığının cluster içinde de ayağa kaldırılması gerekti.</w:t>
+        <w:t xml:space="preserve">CI'da gerçek Minikube deploy ve E2E/k6 otomasyonu: app açılışta Alembic migration koştuğu için PostgreSQL bağımlılığının cluster içinde de ayağa kaldırılması gerekti; E2E için canlı stack + seed kuruldu.</w:t>
       </w:r>
     </w:p>
     <w:p>
@@ -4074,7 +4074,7 @@
                 <w:sz w:val="20"/>
                 <w:szCs w:val="20"/>
               </w:rPr>
-              <w:t xml:space="preserve">GitHub Actions CI</w:t>
+              <w:t xml:space="preserve">GitHub Actions CI (E2E + k6 dahil)</w:t>
             </w:r>
           </w:p>
         </w:tc>

</xml_diff>